<commit_message>
updates to power analysis code
</commit_message>
<xml_diff>
--- a/CDmem_preregistration.docx
+++ b/CDmem_preregistration.docx
@@ -147,16 +147,11 @@
       <w:pPr>
         <w:rPr>
           <w:rFonts w:ascii="Calibri" w:hAnsi="Calibri" w:cs="Calibri"/>
-          <w:lang w:val="en-GB"/>
-        </w:rPr>
-      </w:pPr>
-      <w:r>
-        <w:rPr>
-          <w:rFonts w:ascii="Calibri" w:hAnsi="Calibri" w:cs="Calibri"/>
-          <w:lang w:val="en-GB"/>
-        </w:rPr>
-        <w:br/>
-      </w:r>
+          <w:i/>
+          <w:iCs/>
+          <w:lang w:val="en-GB"/>
+        </w:rPr>
+      </w:pPr>
       <w:r>
         <w:rPr>
           <w:rFonts w:ascii="Calibri" w:hAnsi="Calibri" w:cs="Calibri"/>
@@ -406,7 +401,23 @@
           <w:sz w:val="22"/>
           <w:szCs w:val="22"/>
         </w:rPr>
-        <w:t xml:space="preserve"> while investigating these hypotheses, therefore exploring the possibility that controlled vs. not controlled items might differentially affect recognition performance.</w:t>
+        <w:t xml:space="preserve"> while investigating these hypotheses, therefore exploring the possibility that </w:t>
+      </w:r>
+      <w:r>
+        <w:rPr>
+          <w:rFonts w:ascii="Calibri" w:hAnsi="Calibri" w:cs="Calibri"/>
+          <w:sz w:val="22"/>
+          <w:szCs w:val="22"/>
+        </w:rPr>
+        <w:t xml:space="preserve">sense / detection of control over </w:t>
+      </w:r>
+      <w:r>
+        <w:rPr>
+          <w:rFonts w:ascii="Calibri" w:hAnsi="Calibri" w:cs="Calibri"/>
+          <w:sz w:val="22"/>
+          <w:szCs w:val="22"/>
+        </w:rPr>
+        <w:t>controlled vs. not controlled items might differentially affect recognition performance.</w:t>
       </w:r>
     </w:p>
     <w:p>
@@ -606,11 +617,10 @@
         <w:pStyle w:val="ListParagraph"/>
         <w:numPr>
           <w:ilvl w:val="0"/>
-          <w:numId w:val="29"/>
+          <w:numId w:val="19"/>
         </w:numPr>
         <w:rPr>
           <w:rFonts w:ascii="Calibri" w:hAnsi="Calibri" w:cs="Calibri"/>
-          <w:lang w:val="en-GB"/>
         </w:rPr>
       </w:pPr>
       <w:r>
@@ -655,6 +665,44 @@
           <w:lang w:val="en-GB"/>
         </w:rPr>
         <w:t xml:space="preserve"> d-prime (d') scores</w:t>
+      </w:r>
+      <w:r>
+        <w:rPr>
+          <w:rFonts w:ascii="Calibri" w:hAnsi="Calibri" w:cs="Calibri"/>
+          <w:lang w:val="en-GB"/>
+        </w:rPr>
+        <w:t xml:space="preserve">. </w:t>
+      </w:r>
+    </w:p>
+    <w:p>
+      <w:pPr>
+        <w:pStyle w:val="ListParagraph"/>
+        <w:numPr>
+          <w:ilvl w:val="0"/>
+          <w:numId w:val="19"/>
+        </w:numPr>
+        <w:rPr>
+          <w:rFonts w:ascii="Calibri" w:hAnsi="Calibri" w:cs="Calibri"/>
+          <w:lang w:val="en-GB"/>
+        </w:rPr>
+      </w:pPr>
+      <w:r>
+        <w:rPr>
+          <w:rStyle w:val="citation-255"/>
+          <w:rFonts w:ascii="Calibri" w:eastAsiaTheme="majorEastAsia" w:hAnsi="Calibri" w:cs="Calibri"/>
+          <w:b/>
+          <w:bCs/>
+          <w:lang w:val="en-GB"/>
+        </w:rPr>
+        <w:t>Reaction Time:</w:t>
+      </w:r>
+      <w:r>
+        <w:rPr>
+          <w:rStyle w:val="citation-255"/>
+          <w:rFonts w:ascii="Calibri" w:eastAsiaTheme="majorEastAsia" w:hAnsi="Calibri" w:cs="Calibri"/>
+          <w:lang w:val="en-GB"/>
+        </w:rPr>
+        <w:t xml:space="preserve"> The latency of the participant's "old/new" recognition judgment</w:t>
       </w:r>
       <w:r>
         <w:rPr>
@@ -687,24 +735,22 @@
           <w:sz w:val="22"/>
           <w:szCs w:val="22"/>
         </w:rPr>
-        <w:t>Reaction Time:</w:t>
-      </w:r>
-      <w:r>
-        <w:rPr>
-          <w:rStyle w:val="citation-255"/>
-          <w:rFonts w:ascii="Calibri" w:eastAsiaTheme="majorEastAsia" w:hAnsi="Calibri" w:cs="Calibri"/>
-          <w:sz w:val="22"/>
-          <w:szCs w:val="22"/>
-        </w:rPr>
-        <w:t xml:space="preserve"> The latency of the participant's "old/new" recognition judgment</w:t>
-      </w:r>
-      <w:r>
-        <w:rPr>
-          <w:rFonts w:ascii="Calibri" w:hAnsi="Calibri" w:cs="Calibri"/>
-          <w:sz w:val="22"/>
-          <w:szCs w:val="22"/>
-        </w:rPr>
-        <w:t xml:space="preserve">. </w:t>
+        <w:t>Control Detection Accuracy</w:t>
+      </w:r>
+      <w:r>
+        <w:rPr>
+          <w:sz w:val="22"/>
+          <w:szCs w:val="22"/>
+        </w:rPr>
+        <w:t>:</w:t>
+      </w:r>
+      <w:r>
+        <w:rPr>
+          <w:rFonts w:ascii="Calibri" w:hAnsi="Calibri" w:cs="Calibri"/>
+          <w:sz w:val="22"/>
+          <w:szCs w:val="22"/>
+        </w:rPr>
+        <w:t xml:space="preserve"> Participants’ accuracy in responses to the question “Which item did you control?”</w:t>
       </w:r>
     </w:p>
     <w:p>
@@ -730,47 +776,6 @@
           <w:sz w:val="22"/>
           <w:szCs w:val="22"/>
         </w:rPr>
-        <w:t>Control Detection Accuracy</w:t>
-      </w:r>
-      <w:r>
-        <w:rPr>
-          <w:sz w:val="22"/>
-          <w:szCs w:val="22"/>
-        </w:rPr>
-        <w:t>:</w:t>
-      </w:r>
-      <w:r>
-        <w:rPr>
-          <w:rFonts w:ascii="Calibri" w:hAnsi="Calibri" w:cs="Calibri"/>
-          <w:sz w:val="22"/>
-          <w:szCs w:val="22"/>
-        </w:rPr>
-        <w:t xml:space="preserve"> Participants’ accuracy in responses to the question “Which item did you control?”</w:t>
-      </w:r>
-    </w:p>
-    <w:p>
-      <w:pPr>
-        <w:pStyle w:val="NormalWeb"/>
-        <w:numPr>
-          <w:ilvl w:val="0"/>
-          <w:numId w:val="19"/>
-        </w:numPr>
-        <w:spacing w:before="0" w:beforeAutospacing="0"/>
-        <w:rPr>
-          <w:rFonts w:ascii="Calibri" w:hAnsi="Calibri" w:cs="Calibri"/>
-          <w:sz w:val="22"/>
-          <w:szCs w:val="22"/>
-        </w:rPr>
-      </w:pPr>
-      <w:r>
-        <w:rPr>
-          <w:rStyle w:val="citation-255"/>
-          <w:rFonts w:ascii="Calibri" w:eastAsiaTheme="majorEastAsia" w:hAnsi="Calibri" w:cs="Calibri"/>
-          <w:b/>
-          <w:bCs/>
-          <w:sz w:val="22"/>
-          <w:szCs w:val="22"/>
-        </w:rPr>
         <w:t>Subjective Control Ratings:</w:t>
       </w:r>
       <w:r>
@@ -953,7 +958,23 @@
           <w:sz w:val="22"/>
           <w:szCs w:val="22"/>
         </w:rPr>
-        <w:t xml:space="preserve">The degree of motor control will be altered via intermixing participants self-motion (of the cursor) with pre-recorded cursor trajectories. The proportion of self-motion is what determines </w:t>
+        <w:t>The degree of motor control will be altered via intermixing participants</w:t>
+      </w:r>
+      <w:r>
+        <w:rPr>
+          <w:rFonts w:ascii="Calibri" w:hAnsi="Calibri" w:cs="Calibri"/>
+          <w:sz w:val="22"/>
+          <w:szCs w:val="22"/>
+        </w:rPr>
+        <w:t>’</w:t>
+      </w:r>
+      <w:r>
+        <w:rPr>
+          <w:rFonts w:ascii="Calibri" w:hAnsi="Calibri" w:cs="Calibri"/>
+          <w:sz w:val="22"/>
+          <w:szCs w:val="22"/>
+        </w:rPr>
+        <w:t xml:space="preserve"> self-motion (of the cursor) with pre-recorded cursor trajectories. The proportion of self-motion is what determines </w:t>
       </w:r>
       <w:r>
         <w:rPr>
@@ -1469,6 +1490,7 @@
           <w:lang w:val="en-GB"/>
         </w:rPr>
       </w:pPr>
+      <w:commentRangeStart w:id="0"/>
       <w:r>
         <w:rPr>
           <w:rFonts w:ascii="Calibri" w:hAnsi="Calibri" w:cs="Calibri"/>
@@ -1486,6 +1508,17 @@
           <w:lang w:val="en-GB"/>
         </w:rPr>
         <w:t xml:space="preserve"> repeated-measures ANOVA on participant d’ values.</w:t>
+      </w:r>
+      <w:commentRangeEnd w:id="0"/>
+      <w:r>
+        <w:rPr>
+          <w:rStyle w:val="CommentReference"/>
+          <w:rFonts w:ascii="Calibri" w:hAnsi="Calibri" w:cs="Calibri"/>
+          <w:sz w:val="22"/>
+          <w:szCs w:val="22"/>
+          <w:lang w:val="en-GB"/>
+        </w:rPr>
+        <w:commentReference w:id="0"/>
       </w:r>
       <w:r>
         <w:rPr>
@@ -2535,7 +2568,7 @@
         </w:rPr>
         <w:br/>
       </w:r>
-      <w:commentRangeStart w:id="0"/>
+      <w:commentRangeStart w:id="1"/>
       <w:r>
         <w:rPr>
           <w:rFonts w:ascii="Calibri" w:hAnsi="Calibri" w:cs="Calibri"/>
@@ -2564,7 +2597,7 @@
         </w:rPr>
         <w:t>using a control-detection task, effect sizes we used in the Monte Carlo analyses were based on studies whose paradigms did not consistently match ours. Also considering logistic and financial dependencies imposed upon many EEG studies, we determine a lower cutoff on our sample size of 30 participants, in case reaching 50 is impossible.</w:t>
       </w:r>
-      <w:commentRangeEnd w:id="0"/>
+      <w:commentRangeEnd w:id="1"/>
       <w:r>
         <w:rPr>
           <w:rStyle w:val="CommentReference"/>
@@ -2573,7 +2606,7 @@
           <w:szCs w:val="22"/>
           <w:lang w:val="en-US"/>
         </w:rPr>
-        <w:commentReference w:id="0"/>
+        <w:commentReference w:id="1"/>
       </w:r>
     </w:p>
     <w:p>
@@ -2609,7 +2642,7 @@
           <w:lang w:val="en-DE"/>
         </w:rPr>
       </w:pPr>
-      <w:commentRangeStart w:id="1"/>
+      <w:commentRangeStart w:id="2"/>
       <w:r>
         <w:rPr>
           <w:rFonts w:ascii="Calibri" w:hAnsi="Calibri" w:cs="Calibri"/>
@@ -2640,7 +2673,7 @@
         </w:rPr>
         <w:t>”</w:t>
       </w:r>
-      <w:commentRangeEnd w:id="1"/>
+      <w:commentRangeEnd w:id="2"/>
       <w:r>
         <w:rPr>
           <w:rStyle w:val="CommentReference"/>
@@ -2651,7 +2684,7 @@
           <w:szCs w:val="22"/>
           <w:lang w:val="en-DE"/>
         </w:rPr>
-        <w:commentReference w:id="1"/>
+        <w:commentReference w:id="2"/>
       </w:r>
     </w:p>
     <w:p>
@@ -3430,7 +3463,7 @@
 
 <file path=word/comments.xml><?xml version="1.0" encoding="utf-8"?>
 <w:comments xmlns:wpc="http://schemas.microsoft.com/office/word/2010/wordprocessingCanvas" xmlns:cx="http://schemas.microsoft.com/office/drawing/2014/chartex" xmlns:cx1="http://schemas.microsoft.com/office/drawing/2015/9/8/chartex" xmlns:cx2="http://schemas.microsoft.com/office/drawing/2015/10/21/chartex" xmlns:cx3="http://schemas.microsoft.com/office/drawing/2016/5/9/chartex" xmlns:cx4="http://schemas.microsoft.com/office/drawing/2016/5/10/chartex" xmlns:cx5="http://schemas.microsoft.com/office/drawing/2016/5/11/chartex" xmlns:cx6="http://schemas.microsoft.com/office/drawing/2016/5/12/chartex" xmlns:cx7="http://schemas.microsoft.com/office/drawing/2016/5/13/chartex" xmlns:cx8="http://schemas.microsoft.com/office/drawing/2016/5/14/chartex" xmlns:mc="http://schemas.openxmlformats.org/markup-compatibility/2006" xmlns:aink="http://schemas.microsoft.com/office/drawing/2016/ink" xmlns:am3d="http://schemas.microsoft.com/office/drawing/2017/model3d" xmlns:o="urn:schemas-microsoft-com:office:office" xmlns:oel="http://schemas.microsoft.com/office/2019/extlst" xmlns:r="http://schemas.openxmlformats.org/officeDocument/2006/relationships" xmlns:m="http://schemas.openxmlformats.org/officeDocument/2006/math" xmlns:v="urn:schemas-microsoft-com:vml" xmlns:wp14="http://schemas.microsoft.com/office/word/2010/wordprocessingDrawing" xmlns:wp="http://schemas.openxmlformats.org/drawingml/2006/wordprocessingDrawing" xmlns:w10="urn:schemas-microsoft-com:office:word" xmlns:w="http://schemas.openxmlformats.org/wordprocessingml/2006/main" xmlns:w14="http://schemas.microsoft.com/office/word/2010/wordml" xmlns:w15="http://schemas.microsoft.com/office/word/2012/wordml" xmlns:w16cex="http://schemas.microsoft.com/office/word/2018/wordml/cex" xmlns:w16cid="http://schemas.microsoft.com/office/word/2016/wordml/cid" xmlns:w16="http://schemas.microsoft.com/office/word/2018/wordml" xmlns:w16du="http://schemas.microsoft.com/office/word/2023/wordml/word16du" xmlns:w16sdtdh="http://schemas.microsoft.com/office/word/2020/wordml/sdtdatahash" xmlns:w16sdtfl="http://schemas.microsoft.com/office/word/2024/wordml/sdtformatlock" xmlns:w16se="http://schemas.microsoft.com/office/word/2015/wordml/symex" xmlns:wpg="http://schemas.microsoft.com/office/word/2010/wordprocessingGroup" xmlns:wpi="http://schemas.microsoft.com/office/word/2010/wordprocessingInk" xmlns:wne="http://schemas.microsoft.com/office/word/2006/wordml" xmlns:wps="http://schemas.microsoft.com/office/word/2010/wordprocessingShape" mc:Ignorable="w14 w15 w16se w16cid w16 w16cex w16sdtdh w16sdtfl w16du wp14">
-  <w:comment w:id="0" w:author="Gezen, Elif" w:date="2026-05-18T14:10:00Z" w:initials="EG">
+  <w:comment w:id="0" w:author="Gezen, Elif" w:date="2026-05-19T10:55:00Z" w:initials="EG">
     <w:p>
       <w:pPr>
         <w:pStyle w:val="CommentText"/>
@@ -3442,11 +3475,34 @@
         <w:annotationRef/>
       </w:r>
       <w:r>
+        <w:t>As far as I understand, reporting d’ is the convention for recognition tasks. Tobias’ group’s last paper only reports that all participants showed a d’ above chance (M, SD). Their main analyses are also GLMMs and LMMs. They also preregistered only the GLMMs and LMMs. Should we directly follow that?</w:t>
+      </w:r>
+      <w:r>
+        <w:br/>
+      </w:r>
+      <w:r>
+        <w:br/>
+        <w:t>On the other hand, this analysis was supposed to be underpowered compared to the models, but we already have significance with 10 people only so maybe it’s worth it to keep it in?</w:t>
+      </w:r>
+    </w:p>
+  </w:comment>
+  <w:comment w:id="1" w:author="Gezen, Elif" w:date="2026-05-18T14:10:00Z" w:initials="EG">
+    <w:p>
+      <w:pPr>
+        <w:pStyle w:val="CommentText"/>
+      </w:pPr>
+      <w:r>
+        <w:rPr>
+          <w:rStyle w:val="CommentReference"/>
+        </w:rPr>
+        <w:annotationRef/>
+      </w:r>
+      <w:r>
         <w:t xml:space="preserve">I hope it is ok to preregister like this? </w:t>
       </w:r>
     </w:p>
   </w:comment>
-  <w:comment w:id="1" w:author="Gezen, Elif" w:date="2026-05-18T14:13:00Z" w:initials="EG">
+  <w:comment w:id="2" w:author="Gezen, Elif" w:date="2026-05-18T14:13:00Z" w:initials="EG">
     <w:p>
       <w:pPr>
         <w:pStyle w:val="CommentText"/>
@@ -3467,6 +3523,7 @@
 
 <file path=word/commentsExtended.xml><?xml version="1.0" encoding="utf-8"?>
 <w15:commentsEx xmlns:wpc="http://schemas.microsoft.com/office/word/2010/wordprocessingCanvas" xmlns:cx="http://schemas.microsoft.com/office/drawing/2014/chartex" xmlns:cx1="http://schemas.microsoft.com/office/drawing/2015/9/8/chartex" xmlns:cx2="http://schemas.microsoft.com/office/drawing/2015/10/21/chartex" xmlns:cx3="http://schemas.microsoft.com/office/drawing/2016/5/9/chartex" xmlns:cx4="http://schemas.microsoft.com/office/drawing/2016/5/10/chartex" xmlns:cx5="http://schemas.microsoft.com/office/drawing/2016/5/11/chartex" xmlns:cx6="http://schemas.microsoft.com/office/drawing/2016/5/12/chartex" xmlns:cx7="http://schemas.microsoft.com/office/drawing/2016/5/13/chartex" xmlns:cx8="http://schemas.microsoft.com/office/drawing/2016/5/14/chartex" xmlns:mc="http://schemas.openxmlformats.org/markup-compatibility/2006" xmlns:aink="http://schemas.microsoft.com/office/drawing/2016/ink" xmlns:am3d="http://schemas.microsoft.com/office/drawing/2017/model3d" xmlns:o="urn:schemas-microsoft-com:office:office" xmlns:oel="http://schemas.microsoft.com/office/2019/extlst" xmlns:r="http://schemas.openxmlformats.org/officeDocument/2006/relationships" xmlns:m="http://schemas.openxmlformats.org/officeDocument/2006/math" xmlns:v="urn:schemas-microsoft-com:vml" xmlns:wp14="http://schemas.microsoft.com/office/word/2010/wordprocessingDrawing" xmlns:wp="http://schemas.openxmlformats.org/drawingml/2006/wordprocessingDrawing" xmlns:w10="urn:schemas-microsoft-com:office:word" xmlns:w="http://schemas.openxmlformats.org/wordprocessingml/2006/main" xmlns:w14="http://schemas.microsoft.com/office/word/2010/wordml" xmlns:w15="http://schemas.microsoft.com/office/word/2012/wordml" xmlns:w16cex="http://schemas.microsoft.com/office/word/2018/wordml/cex" xmlns:w16cid="http://schemas.microsoft.com/office/word/2016/wordml/cid" xmlns:w16="http://schemas.microsoft.com/office/word/2018/wordml" xmlns:w16du="http://schemas.microsoft.com/office/word/2023/wordml/word16du" xmlns:w16sdtdh="http://schemas.microsoft.com/office/word/2020/wordml/sdtdatahash" xmlns:w16sdtfl="http://schemas.microsoft.com/office/word/2024/wordml/sdtformatlock" xmlns:w16se="http://schemas.microsoft.com/office/word/2015/wordml/symex" xmlns:wpg="http://schemas.microsoft.com/office/word/2010/wordprocessingGroup" xmlns:wpi="http://schemas.microsoft.com/office/word/2010/wordprocessingInk" xmlns:wne="http://schemas.microsoft.com/office/word/2006/wordml" xmlns:wps="http://schemas.microsoft.com/office/word/2010/wordprocessingShape" mc:Ignorable="w14 w15 w16se w16cid w16 w16cex w16sdtdh w16sdtfl w16du wp14">
+  <w15:commentEx w15:paraId="5080973B" w15:done="0"/>
   <w15:commentEx w15:paraId="1A296DB5" w15:done="0"/>
   <w15:commentEx w15:paraId="5A87A80C" w15:done="0"/>
 </w15:commentsEx>
@@ -3474,6 +3531,7 @@
 
 <file path=word/commentsExtensible.xml><?xml version="1.0" encoding="utf-8"?>
 <w16cex:commentsExtensible xmlns:wpc="http://schemas.microsoft.com/office/word/2010/wordprocessingCanvas" xmlns:cx="http://schemas.microsoft.com/office/drawing/2014/chartex" xmlns:cx1="http://schemas.microsoft.com/office/drawing/2015/9/8/chartex" xmlns:cx2="http://schemas.microsoft.com/office/drawing/2015/10/21/chartex" xmlns:cx3="http://schemas.microsoft.com/office/drawing/2016/5/9/chartex" xmlns:cx4="http://schemas.microsoft.com/office/drawing/2016/5/10/chartex" xmlns:cx5="http://schemas.microsoft.com/office/drawing/2016/5/11/chartex" xmlns:cx6="http://schemas.microsoft.com/office/drawing/2016/5/12/chartex" xmlns:cx7="http://schemas.microsoft.com/office/drawing/2016/5/13/chartex" xmlns:cx8="http://schemas.microsoft.com/office/drawing/2016/5/14/chartex" xmlns:cr="http://schemas.microsoft.com/office/comments/2020/reactions" xmlns:mc="http://schemas.openxmlformats.org/markup-compatibility/2006" xmlns:aink="http://schemas.microsoft.com/office/drawing/2016/ink" xmlns:am3d="http://schemas.microsoft.com/office/drawing/2017/model3d" xmlns:o="urn:schemas-microsoft-com:office:office" xmlns:oel="http://schemas.microsoft.com/office/2019/extlst" xmlns:r="http://schemas.openxmlformats.org/officeDocument/2006/relationships" xmlns:m="http://schemas.openxmlformats.org/officeDocument/2006/math" xmlns:v="urn:schemas-microsoft-com:vml" xmlns:wp14="http://schemas.microsoft.com/office/word/2010/wordprocessingDrawing" xmlns:wp="http://schemas.openxmlformats.org/drawingml/2006/wordprocessingDrawing" xmlns:w10="urn:schemas-microsoft-com:office:word" xmlns:w="http://schemas.openxmlformats.org/wordprocessingml/2006/main" xmlns:w14="http://schemas.microsoft.com/office/word/2010/wordml" xmlns:w15="http://schemas.microsoft.com/office/word/2012/wordml" xmlns:w16cex="http://schemas.microsoft.com/office/word/2018/wordml/cex" xmlns:w16cid="http://schemas.microsoft.com/office/word/2016/wordml/cid" xmlns:w16="http://schemas.microsoft.com/office/word/2018/wordml" xmlns:w16du="http://schemas.microsoft.com/office/word/2023/wordml/word16du" xmlns:w16sdtdh="http://schemas.microsoft.com/office/word/2020/wordml/sdtdatahash" xmlns:w16sdtfl="http://schemas.microsoft.com/office/word/2024/wordml/sdtformatlock" xmlns:w16se="http://schemas.microsoft.com/office/word/2015/wordml/symex" xmlns:wpg="http://schemas.microsoft.com/office/word/2010/wordprocessingGroup" xmlns:wpi="http://schemas.microsoft.com/office/word/2010/wordprocessingInk" xmlns:wne="http://schemas.microsoft.com/office/word/2006/wordml" xmlns:wps="http://schemas.microsoft.com/office/word/2010/wordprocessingShape" mc:Ignorable="w14 w15 w16se w16cid w16 w16cex w16sdtdh w16sdtfl cr w16du wp14">
+  <w16cex:commentExtensible w16cex:durableId="1F075A42" w16cex:dateUtc="2026-05-19T08:55:00Z"/>
   <w16cex:commentExtensible w16cex:durableId="6896479D" w16cex:dateUtc="2026-05-18T12:10:00Z"/>
   <w16cex:commentExtensible w16cex:durableId="1295E866" w16cex:dateUtc="2026-05-18T12:13:00Z"/>
 </w16cex:commentsExtensible>
@@ -3481,6 +3539,7 @@
 
 <file path=word/commentsIds.xml><?xml version="1.0" encoding="utf-8"?>
 <w16cid:commentsIds xmlns:wpc="http://schemas.microsoft.com/office/word/2010/wordprocessingCanvas" xmlns:cx="http://schemas.microsoft.com/office/drawing/2014/chartex" xmlns:cx1="http://schemas.microsoft.com/office/drawing/2015/9/8/chartex" xmlns:cx2="http://schemas.microsoft.com/office/drawing/2015/10/21/chartex" xmlns:cx3="http://schemas.microsoft.com/office/drawing/2016/5/9/chartex" xmlns:cx4="http://schemas.microsoft.com/office/drawing/2016/5/10/chartex" xmlns:cx5="http://schemas.microsoft.com/office/drawing/2016/5/11/chartex" xmlns:cx6="http://schemas.microsoft.com/office/drawing/2016/5/12/chartex" xmlns:cx7="http://schemas.microsoft.com/office/drawing/2016/5/13/chartex" xmlns:cx8="http://schemas.microsoft.com/office/drawing/2016/5/14/chartex" xmlns:mc="http://schemas.openxmlformats.org/markup-compatibility/2006" xmlns:aink="http://schemas.microsoft.com/office/drawing/2016/ink" xmlns:am3d="http://schemas.microsoft.com/office/drawing/2017/model3d" xmlns:o="urn:schemas-microsoft-com:office:office" xmlns:oel="http://schemas.microsoft.com/office/2019/extlst" xmlns:r="http://schemas.openxmlformats.org/officeDocument/2006/relationships" xmlns:m="http://schemas.openxmlformats.org/officeDocument/2006/math" xmlns:v="urn:schemas-microsoft-com:vml" xmlns:wp14="http://schemas.microsoft.com/office/word/2010/wordprocessingDrawing" xmlns:wp="http://schemas.openxmlformats.org/drawingml/2006/wordprocessingDrawing" xmlns:w10="urn:schemas-microsoft-com:office:word" xmlns:w="http://schemas.openxmlformats.org/wordprocessingml/2006/main" xmlns:w14="http://schemas.microsoft.com/office/word/2010/wordml" xmlns:w15="http://schemas.microsoft.com/office/word/2012/wordml" xmlns:w16cex="http://schemas.microsoft.com/office/word/2018/wordml/cex" xmlns:w16cid="http://schemas.microsoft.com/office/word/2016/wordml/cid" xmlns:w16="http://schemas.microsoft.com/office/word/2018/wordml" xmlns:w16du="http://schemas.microsoft.com/office/word/2023/wordml/word16du" xmlns:w16sdtdh="http://schemas.microsoft.com/office/word/2020/wordml/sdtdatahash" xmlns:w16sdtfl="http://schemas.microsoft.com/office/word/2024/wordml/sdtformatlock" xmlns:w16se="http://schemas.microsoft.com/office/word/2015/wordml/symex" xmlns:wpg="http://schemas.microsoft.com/office/word/2010/wordprocessingGroup" xmlns:wpi="http://schemas.microsoft.com/office/word/2010/wordprocessingInk" xmlns:wne="http://schemas.microsoft.com/office/word/2006/wordml" xmlns:wps="http://schemas.microsoft.com/office/word/2010/wordprocessingShape" mc:Ignorable="w14 w15 w16se w16cid w16 w16cex w16sdtdh w16sdtfl w16du wp14">
+  <w16cid:commentId w16cid:paraId="5080973B" w16cid:durableId="1F075A42"/>
   <w16cid:commentId w16cid:paraId="1A296DB5" w16cid:durableId="6896479D"/>
   <w16cid:commentId w16cid:paraId="5A87A80C" w16cid:durableId="1295E866"/>
 </w16cid:commentsIds>

</xml_diff>